<commit_message>
fix(documents): deterministic fixtures; tabs, breaks and paragraph separators
Co-Authored-By: Claude Fable 5.1 <noreply@anthropic.com>
Claude-Session: https://claude.ai/code/session_01NC7DaU2NnuShutQWthiRhF
</commit_message>
<xml_diff>
--- a/tests/fixtures/docs/sample.docx
+++ b/tests/fixtures/docs/sample.docx
@@ -12,7 +12,19 @@
     </w:p>
     <w:p>
       <w:r>
-        <w:t>Sample size was 312 participants recruited from the general population.</w:t>
+        <w:t>Sample size</w:t>
+      </w:r>
+      <w:r>
+        <w:tab/>
+      </w:r>
+      <w:r>
+        <w:t>was 312 participants recruited from the general population.</w:t>
+      </w:r>
+      <w:r>
+        <w:br/>
+      </w:r>
+      <w:r>
+        <w:t>Second line.</w:t>
       </w:r>
     </w:p>
     <w:tbl>

</xml_diff>